<commit_message>
Complete local draft backups, reject missing reports and remove personal template data
</commit_message>
<xml_diff>
--- a/assets/templates/Einsatzbericht-Wordvorlage-Kreuze-FINAL.docx
+++ b/assets/templates/Einsatzbericht-Wordvorlage-Kreuze-FINAL.docx
@@ -4607,7 +4607,7 @@
                 <w:sz w:val="22"/>
                 <w:szCs w:val="22"/>
               </w:rPr>
-              <w:t xml:space="preserve">C. </w:t>
+              <w:t xml:space="preserve">KBM / Vertretung</w:t>
             </w:r>
             <w:proofErr w:type="spellStart"/>
             <w:r>
@@ -4616,7 +4616,7 @@
                 <w:sz w:val="22"/>
                 <w:szCs w:val="22"/>
               </w:rPr>
-              <w:t>Leiberich</w:t>
+              <w:t/>
             </w:r>
             <w:proofErr w:type="spellEnd"/>
           </w:p>
@@ -4656,7 +4656,7 @@
                 <w:sz w:val="22"/>
                 <w:szCs w:val="22"/>
               </w:rPr>
-              <w:t>R. Kesselring</w:t>
+              <w:t>KBM / Vertretung</w:t>
             </w:r>
           </w:p>
         </w:tc>
@@ -4712,7 +4712,7 @@
                 <w:sz w:val="22"/>
                 <w:szCs w:val="22"/>
               </w:rPr>
-              <w:t>Hämmerle</w:t>
+              <w:t>KBM / Vertretung</w:t>
             </w:r>
           </w:p>
         </w:tc>
@@ -4751,23 +4751,23 @@
                 <w:sz w:val="22"/>
                 <w:szCs w:val="22"/>
               </w:rPr>
-              <w:t>A.</w:t>
-            </w:r>
-            <w:r>
-              <w:rPr>
-                <w:rFonts w:cs="Arial"/>
-                <w:sz w:val="22"/>
-                <w:szCs w:val="22"/>
-              </w:rPr>
-              <w:t xml:space="preserve"> </w:t>
-            </w:r>
-            <w:r>
-              <w:rPr>
-                <w:rFonts w:cs="Arial"/>
-                <w:sz w:val="22"/>
-                <w:szCs w:val="22"/>
-              </w:rPr>
-              <w:t>Stiegler</w:t>
+              <w:t>KBM / Vertretung</w:t>
+            </w:r>
+            <w:r>
+              <w:rPr>
+                <w:rFonts w:cs="Arial"/>
+                <w:sz w:val="22"/>
+                <w:szCs w:val="22"/>
+              </w:rPr>
+              <w:t xml:space="preserve"/>
+            </w:r>
+            <w:r>
+              <w:rPr>
+                <w:rFonts w:cs="Arial"/>
+                <w:sz w:val="22"/>
+                <w:szCs w:val="22"/>
+              </w:rPr>
+              <w:t/>
             </w:r>
           </w:p>
         </w:tc>
@@ -4884,7 +4884,7 @@
                 <w:sz w:val="22"/>
                 <w:szCs w:val="22"/>
               </w:rPr>
-              <w:t>Ehrhardt</w:t>
+              <w:t>Verwaltung</w:t>
             </w:r>
           </w:p>
         </w:tc>

</xml_diff>

<commit_message>
Bereinigung, geprüfte lokale Sicherungen und bereinigte Wordvorlagen (#108)
* Remove unused frontend code and obsolete offline downloads

* Complete local draft backups, reject missing reports and remove personal template data

* Clarify live backup inventory and permission audit scope
</commit_message>
<xml_diff>
--- a/assets/templates/Einsatzbericht-Wordvorlage-Kreuze-FINAL.docx
+++ b/assets/templates/Einsatzbericht-Wordvorlage-Kreuze-FINAL.docx
@@ -4607,7 +4607,7 @@
                 <w:sz w:val="22"/>
                 <w:szCs w:val="22"/>
               </w:rPr>
-              <w:t xml:space="preserve">C. </w:t>
+              <w:t xml:space="preserve">KBM / Vertretung</w:t>
             </w:r>
             <w:proofErr w:type="spellStart"/>
             <w:r>
@@ -4616,7 +4616,7 @@
                 <w:sz w:val="22"/>
                 <w:szCs w:val="22"/>
               </w:rPr>
-              <w:t>Leiberich</w:t>
+              <w:t/>
             </w:r>
             <w:proofErr w:type="spellEnd"/>
           </w:p>
@@ -4656,7 +4656,7 @@
                 <w:sz w:val="22"/>
                 <w:szCs w:val="22"/>
               </w:rPr>
-              <w:t>R. Kesselring</w:t>
+              <w:t>KBM / Vertretung</w:t>
             </w:r>
           </w:p>
         </w:tc>
@@ -4712,7 +4712,7 @@
                 <w:sz w:val="22"/>
                 <w:szCs w:val="22"/>
               </w:rPr>
-              <w:t>Hämmerle</w:t>
+              <w:t>KBM / Vertretung</w:t>
             </w:r>
           </w:p>
         </w:tc>
@@ -4751,23 +4751,23 @@
                 <w:sz w:val="22"/>
                 <w:szCs w:val="22"/>
               </w:rPr>
-              <w:t>A.</w:t>
-            </w:r>
-            <w:r>
-              <w:rPr>
-                <w:rFonts w:cs="Arial"/>
-                <w:sz w:val="22"/>
-                <w:szCs w:val="22"/>
-              </w:rPr>
-              <w:t xml:space="preserve"> </w:t>
-            </w:r>
-            <w:r>
-              <w:rPr>
-                <w:rFonts w:cs="Arial"/>
-                <w:sz w:val="22"/>
-                <w:szCs w:val="22"/>
-              </w:rPr>
-              <w:t>Stiegler</w:t>
+              <w:t>KBM / Vertretung</w:t>
+            </w:r>
+            <w:r>
+              <w:rPr>
+                <w:rFonts w:cs="Arial"/>
+                <w:sz w:val="22"/>
+                <w:szCs w:val="22"/>
+              </w:rPr>
+              <w:t xml:space="preserve"/>
+            </w:r>
+            <w:r>
+              <w:rPr>
+                <w:rFonts w:cs="Arial"/>
+                <w:sz w:val="22"/>
+                <w:szCs w:val="22"/>
+              </w:rPr>
+              <w:t/>
             </w:r>
           </w:p>
         </w:tc>
@@ -4884,7 +4884,7 @@
                 <w:sz w:val="22"/>
                 <w:szCs w:val="22"/>
               </w:rPr>
-              <w:t>Ehrhardt</w:t>
+              <w:t>Verwaltung</w:t>
             </w:r>
           </w:p>
         </w:tc>

</xml_diff>